<commit_message>
Lab1: replace manual TOC with a real Word TOC field (indexation)
</commit_message>
<xml_diff>
--- a/Lab1/Lab1_PlesuDinu_FAF-241.docx
+++ b/Lab1/Lab1_PlesuDinu_FAF-241.docx
@@ -232,59 +232,78 @@
     </w:p>
     <w:p>
       <w:pPr>
-        <w:spacing w:after="80"/>
-      </w:pPr>
-      <w:r>
+        <w:spacing w:after="130"/>
+      </w:pPr>
+      <w:r>
+        <w:fldChar w:fldCharType="begin" w:dirty="true"/>
+      </w:r>
+      <w:r>
+        <w:instrText xml:space="preserve"> TOC \o "1-2" \h \z \u </w:instrText>
+      </w:r>
+      <w:r>
+        <w:fldChar w:fldCharType="separate"/>
+      </w:r>
+      <w:r>
+        <w:rPr/>
         <w:t>1.  Purpose of the Work</w:t>
       </w:r>
     </w:p>
     <w:p>
       <w:pPr>
-        <w:spacing w:after="80"/>
-      </w:pPr>
-      <w:r>
+        <w:spacing w:after="130"/>
+      </w:pPr>
+      <w:r>
+        <w:rPr/>
         <w:t>2.  Initial Setup</w:t>
       </w:r>
     </w:p>
     <w:p>
       <w:pPr>
-        <w:spacing w:after="80"/>
-      </w:pPr>
-      <w:r>
+        <w:spacing w:after="130"/>
+      </w:pPr>
+      <w:r>
+        <w:rPr/>
         <w:t>3.  Part 1 – Files and Directories</w:t>
       </w:r>
     </w:p>
     <w:p>
       <w:pPr>
-        <w:spacing w:after="80"/>
-      </w:pPr>
-      <w:r>
+        <w:spacing w:after="130"/>
+      </w:pPr>
+      <w:r>
+        <w:rPr/>
         <w:t>4.  Part 2 – Processes</w:t>
       </w:r>
     </w:p>
     <w:p>
       <w:pPr>
-        <w:spacing w:after="80"/>
-      </w:pPr>
-      <w:r>
+        <w:spacing w:after="130"/>
+      </w:pPr>
+      <w:r>
+        <w:rPr/>
         <w:t>5.  Part 3 – Memory</w:t>
       </w:r>
     </w:p>
     <w:p>
       <w:pPr>
-        <w:spacing w:after="80"/>
-      </w:pPr>
-      <w:r>
+        <w:spacing w:after="130"/>
+      </w:pPr>
+      <w:r>
+        <w:rPr/>
         <w:t>6.  Part 4 – Devices and Storage</w:t>
       </w:r>
     </w:p>
     <w:p>
       <w:pPr>
-        <w:spacing w:after="80"/>
-      </w:pPr>
-      <w:r>
+        <w:spacing w:after="130"/>
+      </w:pPr>
+      <w:r>
+        <w:rPr/>
         <w:t>7.  Conclusion</w:t>
       </w:r>
+      <w:r>
+        <w:fldChar w:fldCharType="end"/>
+      </w:r>
     </w:p>
     <w:p>
       <w:r>
@@ -292,6 +311,7 @@
       </w:r>
     </w:p>
     <w:p>
+      <w:bookmarkStart w:id="1001" w:name="_Toc1001"/>
       <w:pPr>
         <w:pStyle w:val="Heading1"/>
       </w:pPr>
@@ -301,6 +321,7 @@
         </w:rPr>
         <w:t>1.  Purpose of the Work</w:t>
       </w:r>
+      <w:bookmarkEnd w:id="1001"/>
     </w:p>
     <w:p>
       <w:pPr>
@@ -311,6 +332,7 @@
       </w:r>
     </w:p>
     <w:p>
+      <w:bookmarkStart w:id="1002" w:name="_Toc1002"/>
       <w:pPr>
         <w:pStyle w:val="Heading1"/>
       </w:pPr>
@@ -320,6 +342,7 @@
         </w:rPr>
         <w:t>2.  Initial Setup</w:t>
       </w:r>
+      <w:bookmarkEnd w:id="1002"/>
     </w:p>
     <w:p>
       <w:pPr>
@@ -399,6 +422,7 @@
       </w:r>
     </w:p>
     <w:p>
+      <w:bookmarkStart w:id="1003" w:name="_Toc1003"/>
       <w:pPr>
         <w:pStyle w:val="Heading1"/>
       </w:pPr>
@@ -408,6 +432,7 @@
         </w:rPr>
         <w:t>3.  Part 1 – Files and Directories</w:t>
       </w:r>
+      <w:bookmarkEnd w:id="1003"/>
     </w:p>
     <w:p>
       <w:pPr>
@@ -653,6 +678,7 @@
       </w:r>
     </w:p>
     <w:p>
+      <w:bookmarkStart w:id="1004" w:name="_Toc1004"/>
       <w:pPr>
         <w:pStyle w:val="Heading2"/>
       </w:pPr>
@@ -662,6 +688,7 @@
         </w:rPr>
         <w:t>3.1.  Observations</w:t>
       </w:r>
+      <w:bookmarkEnd w:id="1004"/>
     </w:p>
     <w:p>
       <w:pPr>
@@ -672,6 +699,7 @@
       </w:r>
     </w:p>
     <w:p>
+      <w:bookmarkStart w:id="1005" w:name="_Toc1005"/>
       <w:pPr>
         <w:pStyle w:val="Heading1"/>
       </w:pPr>
@@ -681,6 +709,7 @@
         </w:rPr>
         <w:t>4.  Part 2 – Processes</w:t>
       </w:r>
+      <w:bookmarkEnd w:id="1005"/>
     </w:p>
     <w:p>
       <w:pPr>
@@ -920,6 +949,7 @@
       </w:r>
     </w:p>
     <w:p>
+      <w:bookmarkStart w:id="1006" w:name="_Toc1006"/>
       <w:pPr>
         <w:pStyle w:val="Heading2"/>
       </w:pPr>
@@ -929,6 +959,7 @@
         </w:rPr>
         <w:t>4.1.  Observations</w:t>
       </w:r>
+      <w:bookmarkEnd w:id="1006"/>
     </w:p>
     <w:p>
       <w:pPr>
@@ -939,6 +970,7 @@
       </w:r>
     </w:p>
     <w:p>
+      <w:bookmarkStart w:id="1007" w:name="_Toc1007"/>
       <w:pPr>
         <w:pStyle w:val="Heading1"/>
       </w:pPr>
@@ -948,6 +980,7 @@
         </w:rPr>
         <w:t>5.  Part 3 – Memory</w:t>
       </w:r>
+      <w:bookmarkEnd w:id="1007"/>
     </w:p>
     <w:p>
       <w:pPr>
@@ -1090,6 +1123,7 @@
       </w:r>
     </w:p>
     <w:p>
+      <w:bookmarkStart w:id="1008" w:name="_Toc1008"/>
       <w:pPr>
         <w:pStyle w:val="Heading2"/>
       </w:pPr>
@@ -1099,6 +1133,7 @@
         </w:rPr>
         <w:t>5.1.  Observations</w:t>
       </w:r>
+      <w:bookmarkEnd w:id="1008"/>
     </w:p>
     <w:p>
       <w:pPr>
@@ -1109,6 +1144,7 @@
       </w:r>
     </w:p>
     <w:p>
+      <w:bookmarkStart w:id="1009" w:name="_Toc1009"/>
       <w:pPr>
         <w:pStyle w:val="Heading1"/>
       </w:pPr>
@@ -1118,6 +1154,7 @@
         </w:rPr>
         <w:t>6.  Part 4 – Devices and Storage</w:t>
       </w:r>
+      <w:bookmarkEnd w:id="1009"/>
     </w:p>
     <w:p>
       <w:pPr>
@@ -1311,6 +1348,7 @@
       </w:r>
     </w:p>
     <w:p>
+      <w:bookmarkStart w:id="1010" w:name="_Toc1010"/>
       <w:pPr>
         <w:pStyle w:val="Heading2"/>
       </w:pPr>
@@ -1320,6 +1358,7 @@
         </w:rPr>
         <w:t>6.1.  Observations</w:t>
       </w:r>
+      <w:bookmarkEnd w:id="1010"/>
     </w:p>
     <w:p>
       <w:pPr>
@@ -1330,6 +1369,7 @@
       </w:r>
     </w:p>
     <w:p>
+      <w:bookmarkStart w:id="1011" w:name="_Toc1011"/>
       <w:pPr>
         <w:pStyle w:val="Heading1"/>
       </w:pPr>
@@ -1339,6 +1379,7 @@
         </w:rPr>
         <w:t>7.  Conclusion</w:t>
       </w:r>
+      <w:bookmarkEnd w:id="1011"/>
     </w:p>
     <w:p>
       <w:pPr>

</xml_diff>